<commit_message>
fix(ui): toi uu flex min-w-0 min-h-0 cho khung de thi va editor chong thieu cho
</commit_message>
<xml_diff>
--- a/public/data/DE_KTGK/10.docx
+++ b/public/data/DE_KTGK/10.docx
@@ -5,9 +5,28 @@
     <w:p>
       <w:pPr>
         <w:spacing w:before="240" w:after="80"/>
+        <w:rPr>
+          <w:b/>
+          <w:color w:val="1F4E79"/>
+          <w:sz w:val="24"/>
+        </w:rPr>
       </w:pPr>
       <w:r>
-        <w:t>📌 ĐỀ SỐ 10: NHẬP SỐ KHÁC 0</w:t>
+        <w:rPr>
+          <w:rFonts w:ascii="Segoe UI Emoji" w:hAnsi="Segoe UI Emoji" w:cs="Segoe UI Emoji"/>
+          <w:b/>
+          <w:color w:val="1F4E79"/>
+          <w:sz w:val="24"/>
+        </w:rPr>
+        <w:t>📌</w:t>
+      </w:r>
+      <w:r>
+        <w:rPr>
+          <w:b/>
+          <w:color w:val="1F4E79"/>
+          <w:sz w:val="24"/>
+        </w:rPr>
+        <w:t xml:space="preserve"> ĐỀ SỐ 10: NHẬP SỐ KHÁC 0</w:t>
       </w:r>
     </w:p>
     <w:tbl>
@@ -36,7 +55,6 @@
             </w:tcMar>
           </w:tcPr>
           <w:p>
-            <w:r/>
             <w:r>
               <w:rPr>
                 <w:b/>
@@ -44,9 +62,6 @@
               <w:t xml:space="preserve">Yêu cầu đề bài: </w:t>
             </w:r>
             <w:r>
-              <w:rPr>
-                <w:b w:val="0"/>
-              </w:rPr>
               <w:t>Viết chương trình yêu cầu nhập vào một số nguyên khác 0 n từ bàn phím (kiểu int). Nếu người dùng nhập số 0 thì phải yêu cầu nhập lại liên tục cho đến khi nhận được một số khác 0 thì dừng và in ra màn hình: DA NHAP SO KHAC 0.</w:t>
             </w:r>
           </w:p>
@@ -68,7 +83,20 @@
           </w:tcPr>
           <w:p>
             <w:r>
-              <w:t>Ví dụ Test Case — Đầu vào (Input): 0 0 5  |  Đầu ra (Output): DA NHAP SO KHAC 0</w:t>
+              <w:rPr>
+                <w:b/>
+                <w:bCs/>
+              </w:rPr>
+              <w:t>Ví dụ Test Case</w:t>
+            </w:r>
+            <w:r>
+              <w:t xml:space="preserve"> — </w:t>
+            </w:r>
+            <w:r>
+              <w:rPr>
+                <w:color w:val="006600"/>
+              </w:rPr>
+              <w:t>Đầu vào (Input): 0 0 5  |  Đầu ra (Output): DA NHAP SO KHAC 0</w:t>
             </w:r>
           </w:p>
         </w:tc>

</xml_diff>